<commit_message>
feat: confirmation d'adresse e-mail à l'inscription
- E-mail de vérification à l'inscription (jeton usage unique, hash SHA-256)
- POST /api/email/verify (public) + page front /verify-email
- Le reset de mot de passe n'est actif que pour une adresse confirmée
  (anti-abus, consentement RGPD type double opt-in)
- app:mail-test envoie désormais les 3 gabarits
- Dossier Bloc 2 v4 et CHANGELOG synchronisés (169 tests : 51 back, 118 front)

Co-Authored-By: Claude Fable 5 <noreply@anthropic.com>
</commit_message>
<xml_diff>
--- a/dossier/Dossier_Bloc2_Albion_Helper_v4.docx
+++ b/dossier/Dossier_Bloc2_Albion_Helper_v4.docx
@@ -3958,7 +3958,7 @@
       </w:r>
       <w:proofErr w:type="spellEnd"/>
       <w:r>
-        <w:t>, inaccessibles à JavaScript. La v3.2.0 complète le compte utilisateur d'une récupération par e-mail : réinitialisation du mot de passe via un lien à usage unique valable une heure, envoyé par le service transactionnel Brevo.</w:t>
+        <w:t>, inaccessibles à JavaScript. La v3.2.0 complète le compte utilisateur d'une récupération par e-mail : réinitialisation du mot de passe via un lien à usage unique valable une heure, envoyé par le service transactionnel Brevo — l'adresse est confirmée à l'inscription par un e-mail de vérification.</w:t>
       </w:r>
     </w:p>
     <w:tbl>
@@ -4020,7 +4020,7 @@
                 <w:sz w:val="46"/>
                 <w:szCs w:val="46"/>
               </w:rPr>
-              <w:t>164</w:t>
+              <w:t>169</w:t>
             </w:r>
           </w:p>
           <w:p>
@@ -8785,7 +8785,7 @@
       </w:r>
       <w:proofErr w:type="spellEnd"/>
       <w:r>
-        <w:t xml:space="preserve"> doit encore passer les 164 tests de la CI avant de pouvoir être fusionné.</w:t>
+        <w:t xml:space="preserve"> doit encore passer les 169 tests de la CI avant de pouvoir être fusionné.</w:t>
       </w:r>
     </w:p>
     <w:p>
@@ -12018,7 +12018,7 @@
           <w:sz w:val="18"/>
           <w:szCs w:val="18"/>
         </w:rPr>
-        <w:t xml:space="preserve">Figure 13 — Étapes du pipeline d'intégration continue : deux jobs parallèles, 164 tests bloquants avant toute fusion</w:t>
+        <w:t xml:space="preserve">Figure 13 — Étapes du pipeline d'intégration continue : deux jobs parallèles, 169 tests bloquants avant toute fusion</w:t>
       </w:r>
     </w:p>
     <w:p>
@@ -12027,7 +12027,7 @@
         <w:jc w:val="both"/>
       </w:pPr>
       <w:r>
-        <w:t xml:space="preserve">Les deux jobs (backend-tests, frontend-tests) tournent en parallèle. Tout échec bloque la fusion et le déploiement : c'est la barrière anti-régression du projet — 164 tests au total. </w:t>
+        <w:t xml:space="preserve">Les deux jobs (backend-tests, frontend-tests) tournent en parallèle. Tout échec bloque la fusion et le déploiement : c'est la barrière anti-régression du projet — 169 tests au total. </w:t>
       </w:r>
       <w:proofErr w:type="spellStart"/>
       <w:r>
@@ -15219,7 +15219,7 @@
                 <w:sz w:val="18"/>
                 <w:szCs w:val="18"/>
               </w:rPr>
-              <w:t>49 tests, 129 assertions</w:t>
+              <w:t>51 tests, 136 assertions</w:t>
             </w:r>
           </w:p>
         </w:tc>
@@ -15375,7 +15375,7 @@
                 <w:sz w:val="18"/>
                 <w:szCs w:val="18"/>
               </w:rPr>
-              <w:t>16 suites — 115 tests</w:t>
+              <w:t>17 suites — 118 tests</w:t>
             </w:r>
           </w:p>
         </w:tc>
@@ -15469,7 +15469,7 @@
           <w:sz w:val="18"/>
           <w:szCs w:val="18"/>
         </w:rPr>
-        <w:t xml:space="preserve">Figure 15 — Exécution réelle des deux suites (19/07/2026) : 49 tests PHPUnit et 115 tests Jest, 164 au total, 100 % verts</w:t>
+        <w:t xml:space="preserve">Figure 15 — Exécution réelle des deux suites (19/07/2026) : 51 tests PHPUnit et 118 tests Jest, 169 au total, 100 % verts</w:t>
       </w:r>
     </w:p>
     <w:p>
@@ -20790,7 +20790,7 @@
         <w:jc w:val="both"/>
       </w:pPr>
       <w:r>
-        <w:t xml:space="preserve">Le principe de minimisation est appliqué à la racine : l'entité User se limite à l'identifiant technique, au pseudonyme, au mot de passe haché, aux rôles, à la date de création et aux préférences d'interface. Depuis la v3.2.0, une adresse e-mail optionnelle peut y être ajoutée, à la seule fin de récupérer son compte (réinitialisation du mot de passe) : elle n'est ni obligatoire, ni exploitée à d'autres fins, et le jeton de réinitialisation n'est stocké qu'en hachage SHA-256 à durée de vie limitée (1 h). Aucun nom réel, aucune autre donnée de contact : il n'y a presque rien à fuiter.</w:t>
+        <w:t xml:space="preserve">Le principe de minimisation est appliqué à la racine : l'entité User se limite à l'identifiant technique, au pseudonyme, au mot de passe haché, aux rôles, à la date de création et aux préférences d'interface. Depuis la v3.2.0, une adresse e-mail optionnelle peut y être ajoutée (confirmée par un e-mail de vérification, double opt-in), à la seule fin de récupérer son compte (réinitialisation du mot de passe) : elle n'est ni obligatoire, ni exploitée à d'autres fins, et le jeton de réinitialisation n'est stocké qu'en hachage SHA-256 à durée de vie limitée (1 h). Aucun nom réel, aucune autre donnée de contact : il n'y a presque rien à fuiter.</w:t>
       </w:r>
     </w:p>
     <w:p>
@@ -22607,7 +22607,7 @@
                 <w:sz w:val="18"/>
                 <w:szCs w:val="18"/>
               </w:rPr>
-              <w:t xml:space="preserve">Récupération de compte : réinitialisation du mot de passe par e-mail (Brevo, jeton à usage unique), alertes de supervision par e-mail, +33 tests (164 au total)</w:t>
+              <w:t xml:space="preserve">Récupération de compte : réinitialisation du mot de passe par e-mail (Brevo, jeton à usage unique), alertes de supervision par e-mail, +38 tests (169 au total)</w:t>
             </w:r>
           </w:p>
         </w:tc>
@@ -23400,7 +23400,7 @@
       </w:pPr>
       <w:r>
         <w:lastRenderedPageBreak/>
-        <w:t>La dernière version du logiciel est fonctionnelle, fiable et viable : la recette complète (29 scénarios, §10) a été déroulée avec 100 % de réussite, les 164 tests automatisés sont verts sur la version 3.2.0 (vérification du 19/07/2026), et l'application est manipulable en autonomie par un utilisateur (tutoriel public avec visite guidée, messages d'erreur explicites).</w:t>
+        <w:t>La dernière version du logiciel est fonctionnelle, fiable et viable : la recette complète (29 scénarios, §10) a été déroulée avec 100 % de réussite, les 169 tests automatisés sont verts sur la version 3.2.0 (vérification du 19/07/2026), et l'application est manipulable en autonomie par un utilisateur (tutoriel public avec visite guidée, messages d'erreur explicites).</w:t>
       </w:r>
     </w:p>
     <w:p>
@@ -33928,7 +33928,7 @@
         <w:jc w:val="both"/>
       </w:pPr>
       <w:r>
-        <w:t>Le registre complet (BUG-001 à BUG-016) est tenu dans le CHANGELOG du dépôt ; chaque correctif est associé à son commit conventionnel et validé par les 164 tests du pipeline avant fusion.</w:t>
+        <w:t>Le registre complet (BUG-001 à BUG-016) est tenu dans le CHANGELOG du dépôt ; chaque correctif est associé à son commit conventionnel et validé par les 169 tests du pipeline avant fusion.</w:t>
       </w:r>
     </w:p>
     <w:p>
@@ -36310,7 +36310,7 @@
                 <w:sz w:val="18"/>
                 <w:szCs w:val="18"/>
               </w:rPr>
-              <w:t xml:space="preserve"> → master : le pipeline exécute les 164 tests puis déploie automatiquement (cf. §5). Retour arrière : </w:t>
+              <w:t xml:space="preserve"> → master : le pipeline exécute les 169 tests puis déploie automatiquement (cf. §5). Retour arrière : </w:t>
             </w:r>
             <w:proofErr w:type="spellStart"/>
             <w:r>
@@ -37562,7 +37562,7 @@
       </w:r>
       <w:proofErr w:type="spellEnd"/>
       <w:r>
-        <w:t>, batailles, statistiques de session, 20 langues) adossé à une architecture en couches maintenable qui a absorbé trois versions majeures sans refonte ; des protocoles d'intégration et de déploiement continus réellement opérationnels (164 tests bloquants, déploiement SSH conditionné, supervision auto-installée) ; un harnais de tests couvrant l'authentification de bout en bout ; des mesures de sécurité alignées sur l'OWASP Top 10 et vérifiées par des tests structurels ; une démarche d'accessibilité outillée (RGAA 4.1, Lighthouse 93-100, axe-</w:t>
+        <w:t>, batailles, statistiques de session, 20 langues) adossé à une architecture en couches maintenable qui a absorbé trois versions majeures sans refonte ; des protocoles d'intégration et de déploiement continus réellement opérationnels (169 tests bloquants, déploiement SSH conditionné, supervision auto-installée) ; un harnais de tests couvrant l'authentification de bout en bout ; des mesures de sécurité alignées sur l'OWASP Top 10 et vérifiées par des tests structurels ; une démarche d'accessibilité outillée (RGAA 4.1, Lighthouse 93-100, axe-</w:t>
       </w:r>
       <w:proofErr w:type="spellStart"/>
       <w:r>
@@ -42339,7 +42339,7 @@
           <w:sz w:val="18"/>
           <w:szCs w:val="18"/>
         </w:rPr>
-        <w:t>Le déploiement n'est possible que depuis master, après succès des 164 tests, via des secrets GitHub.</w:t>
+        <w:t>Le déploiement n'est possible que depuis master, après succès des 169 tests, via des secrets GitHub.</w:t>
       </w:r>
     </w:p>
     <w:p>

</xml_diff>

<commit_message>
feat: e-mail obligatoire à l'inscription — activation du compte par lien de confirmation
- Inscription : e-mail requis, compte inutilisable avant clic sur le lien
  (UserChecker Symfony sur le firewall api)
- Rétro-compatibilité : les comptes sans e-mail se connectent normalement et
  ajoutent leur adresse via POST /api/profile/email — elle attend en
  pending_email et n'est promue qu'une fois confirmée (jamais de blocage)
- Front : e-mail requis à l'inscription + écran « vérifiez votre boîte mail »,
  bandeau d'ajout d'adresse sur le tableau de bord, message clair au login
  d'un compte non activé
- /api/me expose email/pendingEmail ; 173 tests verts (52 back, 121 front)
- Dossier Bloc 2 v4 et CHANGELOG synchronisés

Co-Authored-By: Claude Fable 5 <noreply@anthropic.com>
</commit_message>
<xml_diff>
--- a/dossier/Dossier_Bloc2_Albion_Helper_v4.docx
+++ b/dossier/Dossier_Bloc2_Albion_Helper_v4.docx
@@ -3958,7 +3958,7 @@
       </w:r>
       <w:proofErr w:type="spellEnd"/>
       <w:r>
-        <w:t>, inaccessibles à JavaScript. La v3.2.0 complète le compte utilisateur d'une récupération par e-mail : réinitialisation du mot de passe via un lien à usage unique valable une heure, envoyé par le service transactionnel Brevo — l'adresse est confirmée à l'inscription par un e-mail de vérification.</w:t>
+        <w:t>, inaccessibles à JavaScript. La v3.2.0 introduit l'activation du compte par e-mail (lien de confirmation à l'inscription, adresse désormais demandée) et la réinitialisation du mot de passe par lien à usage unique valable une heure — envois assurés par le service transactionnel Brevo ; les comptes créés avant peuvent ajouter puis confirmer leur adresse depuis le tableau de bord.</w:t>
       </w:r>
     </w:p>
     <w:tbl>
@@ -4020,7 +4020,7 @@
                 <w:sz w:val="46"/>
                 <w:szCs w:val="46"/>
               </w:rPr>
-              <w:t>169</w:t>
+              <w:t>173</w:t>
             </w:r>
           </w:p>
           <w:p>
@@ -4417,7 +4417,7 @@
                 <w:sz w:val="18"/>
                 <w:szCs w:val="18"/>
               </w:rPr>
-              <w:t xml:space="preserve">Inscription, connexion, réinitialisation du mot de passe par e-mail — JWT en cookies </w:t>
+              <w:t xml:space="preserve">Inscription avec activation par e-mail, connexion, réinitialisation du mot de passe — JWT en cookies </w:t>
             </w:r>
             <w:proofErr w:type="spellStart"/>
             <w:r>
@@ -6797,7 +6797,7 @@
         <w:jc w:val="both"/>
       </w:pPr>
       <w:r>
-        <w:t>Inscription en deux champs (identifiant + mot de passe, e-mail optionnel pour pouvoir récupérer son compte) : aucune autre donnée n'est demandée — la visite guidée interactive est proposée dès l'accueil, avant même la création du compte.</w:t>
+        <w:t>Inscription en deux champs (identifiant, adresse e-mail, mot de passe) — le compte s'active via le lien de confirmation reçu par e-mail : aucune autre donnée n'est demandée — la visite guidée interactive est proposée dès l'accueil, avant même la création du compte.</w:t>
       </w:r>
     </w:p>
     <w:p>
@@ -8785,7 +8785,7 @@
       </w:r>
       <w:proofErr w:type="spellEnd"/>
       <w:r>
-        <w:t xml:space="preserve"> doit encore passer les 169 tests de la CI avant de pouvoir être fusionné.</w:t>
+        <w:t xml:space="preserve"> doit encore passer les 173 tests de la CI avant de pouvoir être fusionné.</w:t>
       </w:r>
     </w:p>
     <w:p>
@@ -12018,7 +12018,7 @@
           <w:sz w:val="18"/>
           <w:szCs w:val="18"/>
         </w:rPr>
-        <w:t xml:space="preserve">Figure 13 — Étapes du pipeline d'intégration continue : deux jobs parallèles, 169 tests bloquants avant toute fusion</w:t>
+        <w:t xml:space="preserve">Figure 13 — Étapes du pipeline d'intégration continue : deux jobs parallèles, 173 tests bloquants avant toute fusion</w:t>
       </w:r>
     </w:p>
     <w:p>
@@ -12027,7 +12027,7 @@
         <w:jc w:val="both"/>
       </w:pPr>
       <w:r>
-        <w:t xml:space="preserve">Les deux jobs (backend-tests, frontend-tests) tournent en parallèle. Tout échec bloque la fusion et le déploiement : c'est la barrière anti-régression du projet — 169 tests au total. </w:t>
+        <w:t xml:space="preserve">Les deux jobs (backend-tests, frontend-tests) tournent en parallèle. Tout échec bloque la fusion et le déploiement : c'est la barrière anti-régression du projet — 173 tests au total. </w:t>
       </w:r>
       <w:proofErr w:type="spellStart"/>
       <w:r>
@@ -15219,7 +15219,7 @@
                 <w:sz w:val="18"/>
                 <w:szCs w:val="18"/>
               </w:rPr>
-              <w:t>51 tests, 136 assertions</w:t>
+              <w:t>52 tests, 146 assertions</w:t>
             </w:r>
           </w:p>
         </w:tc>
@@ -15375,7 +15375,7 @@
                 <w:sz w:val="18"/>
                 <w:szCs w:val="18"/>
               </w:rPr>
-              <w:t>17 suites — 118 tests</w:t>
+              <w:t>18 suites — 121 tests</w:t>
             </w:r>
           </w:p>
         </w:tc>
@@ -15469,7 +15469,7 @@
           <w:sz w:val="18"/>
           <w:szCs w:val="18"/>
         </w:rPr>
-        <w:t xml:space="preserve">Figure 15 — Exécution réelle des deux suites (19/07/2026) : 51 tests PHPUnit et 118 tests Jest, 169 au total, 100 % verts</w:t>
+        <w:t xml:space="preserve">Figure 15 — Exécution réelle des deux suites (19/07/2026) : 52 tests PHPUnit et 121 tests Jest, 173 au total, 100 % verts</w:t>
       </w:r>
     </w:p>
     <w:p>
@@ -20790,7 +20790,7 @@
         <w:jc w:val="both"/>
       </w:pPr>
       <w:r>
-        <w:t xml:space="preserve">Le principe de minimisation est appliqué à la racine : l'entité User se limite à l'identifiant technique, au pseudonyme, au mot de passe haché, aux rôles, à la date de création et aux préférences d'interface. Depuis la v3.2.0, une adresse e-mail optionnelle peut y être ajoutée (confirmée par un e-mail de vérification, double opt-in), à la seule fin de récupérer son compte (réinitialisation du mot de passe) : elle n'est ni obligatoire, ni exploitée à d'autres fins, et le jeton de réinitialisation n'est stocké qu'en hachage SHA-256 à durée de vie limitée (1 h). Aucun nom réel, aucune autre donnée de contact : il n'y a presque rien à fuiter.</w:t>
+        <w:t xml:space="preserve">Le principe de minimisation est appliqué à la racine : l'entité User se limite à l'identifiant technique, au pseudonyme, au mot de passe haché, aux rôles, à la date de création et aux préférences d'interface. Depuis la v3.2.0, l'adresse e-mail demandée à l'inscription est confirmée par un lien d'activation (double opt-in) et ne sert qu'à cela : activer le compte et le récupérer en cas de mot de passe oublié ; elle n'est exploitée à aucune autre fin, et le jeton de réinitialisation n'est stocké qu'en hachage SHA-256 à durée de vie limitée (1 h). Aucun nom réel, aucune autre donnée de contact : il n'y a presque rien à fuiter.</w:t>
       </w:r>
     </w:p>
     <w:p>
@@ -22607,7 +22607,7 @@
                 <w:sz w:val="18"/>
                 <w:szCs w:val="18"/>
               </w:rPr>
-              <w:t xml:space="preserve">Récupération de compte : réinitialisation du mot de passe par e-mail (Brevo, jeton à usage unique), alertes de supervision par e-mail, +38 tests (169 au total)</w:t>
+              <w:t xml:space="preserve">Activation du compte par e-mail (double opt-in, rétro-compatible avec les comptes antérieurs), réinitialisation du mot de passe (Brevo, jeton à usage unique), alertes de supervision, +42 tests (173 au total)</w:t>
             </w:r>
           </w:p>
         </w:tc>
@@ -23400,7 +23400,7 @@
       </w:pPr>
       <w:r>
         <w:lastRenderedPageBreak/>
-        <w:t>La dernière version du logiciel est fonctionnelle, fiable et viable : la recette complète (29 scénarios, §10) a été déroulée avec 100 % de réussite, les 169 tests automatisés sont verts sur la version 3.2.0 (vérification du 19/07/2026), et l'application est manipulable en autonomie par un utilisateur (tutoriel public avec visite guidée, messages d'erreur explicites).</w:t>
+        <w:t>La dernière version du logiciel est fonctionnelle, fiable et viable : la recette complète (29 scénarios, §10) a été déroulée avec 100 % de réussite, les 173 tests automatisés sont verts sur la version 3.2.0 (vérification du 19/07/2026), et l'application est manipulable en autonomie par un utilisateur (tutoriel public avec visite guidée, messages d'erreur explicites).</w:t>
       </w:r>
     </w:p>
     <w:p>
@@ -33928,7 +33928,7 @@
         <w:jc w:val="both"/>
       </w:pPr>
       <w:r>
-        <w:t>Le registre complet (BUG-001 à BUG-016) est tenu dans le CHANGELOG du dépôt ; chaque correctif est associé à son commit conventionnel et validé par les 169 tests du pipeline avant fusion.</w:t>
+        <w:t>Le registre complet (BUG-001 à BUG-016) est tenu dans le CHANGELOG du dépôt ; chaque correctif est associé à son commit conventionnel et validé par les 173 tests du pipeline avant fusion.</w:t>
       </w:r>
     </w:p>
     <w:p>
@@ -36310,7 +36310,7 @@
                 <w:sz w:val="18"/>
                 <w:szCs w:val="18"/>
               </w:rPr>
-              <w:t xml:space="preserve"> → master : le pipeline exécute les 169 tests puis déploie automatiquement (cf. §5). Retour arrière : </w:t>
+              <w:t xml:space="preserve"> → master : le pipeline exécute les 173 tests puis déploie automatiquement (cf. §5). Retour arrière : </w:t>
             </w:r>
             <w:proofErr w:type="spellStart"/>
             <w:r>
@@ -37562,7 +37562,7 @@
       </w:r>
       <w:proofErr w:type="spellEnd"/>
       <w:r>
-        <w:t>, batailles, statistiques de session, 20 langues) adossé à une architecture en couches maintenable qui a absorbé trois versions majeures sans refonte ; des protocoles d'intégration et de déploiement continus réellement opérationnels (169 tests bloquants, déploiement SSH conditionné, supervision auto-installée) ; un harnais de tests couvrant l'authentification de bout en bout ; des mesures de sécurité alignées sur l'OWASP Top 10 et vérifiées par des tests structurels ; une démarche d'accessibilité outillée (RGAA 4.1, Lighthouse 93-100, axe-</w:t>
+        <w:t>, batailles, statistiques de session, 20 langues) adossé à une architecture en couches maintenable qui a absorbé trois versions majeures sans refonte ; des protocoles d'intégration et de déploiement continus réellement opérationnels (173 tests bloquants, déploiement SSH conditionné, supervision auto-installée) ; un harnais de tests couvrant l'authentification de bout en bout ; des mesures de sécurité alignées sur l'OWASP Top 10 et vérifiées par des tests structurels ; une démarche d'accessibilité outillée (RGAA 4.1, Lighthouse 93-100, axe-</w:t>
       </w:r>
       <w:proofErr w:type="spellStart"/>
       <w:r>
@@ -42339,7 +42339,7 @@
           <w:sz w:val="18"/>
           <w:szCs w:val="18"/>
         </w:rPr>
-        <w:t>Le déploiement n'est possible que depuis master, après succès des 169 tests, via des secrets GitHub.</w:t>
+        <w:t>Le déploiement n'est possible que depuis master, après succès des 173 tests, via des secrets GitHub.</w:t>
       </w:r>
     </w:p>
     <w:p>

</xml_diff>